<commit_message>
Ameliorations analyse couverture : recherche, inversion selection, auto-submit select, tooltip templates
</commit_message>
<xml_diff>
--- a/templates/_Racine-Actifs/2026-02_Modèle_FUDBASMA_Contrat_domiciliation.docx
+++ b/templates/_Racine-Actifs/2026-02_Modèle_FUDBASMA_Contrat_domiciliation.docx
@@ -904,7 +904,7 @@
                 <w:szCs w:val="14"/>
                 <w:lang w:val="fr-FR"/>
               </w:rPr>
-              <w:t>{{CIVIL}}</w:t>
+              <w:t>{{ ASSOCIE_CIVILITE }}</w:t>
             </w:r>
           </w:p>
         </w:tc>
@@ -1138,7 +1138,7 @@
                 <w:szCs w:val="14"/>
                 <w:lang w:val="fr-FR"/>
               </w:rPr>
-              <w:t>{{CIN_NUM}}</w:t>
+              <w:t>{{ ASSOCIE_CIN }}</w:t>
             </w:r>
           </w:p>
         </w:tc>
@@ -3791,7 +3791,7 @@
           <w:szCs w:val="14"/>
           <w:lang w:val="fr-FR"/>
         </w:rPr>
-        <w:t>{{CIVIL}} {{PRENOM}} {{NOM}},</w:t>
+        <w:t>{{ ASSOCIE_CIVILITE }} {{PRENOM}} {{NOM}}, agissant en qualité de gérant de la société « {{DEN_STE}} {{FORME_JUR}} », donne procuration à la Société « CENTIRIO SARLAU », pour   la   réception   de   tous   courriers   ou   notifications   au   nom   de   la   société {{DEN_STE}} {{FORME_JUR}}.</w:t>
       </w:r>
       <w:r>
         <w:rPr>
@@ -3800,15 +3800,15 @@
           <w:szCs w:val="14"/>
           <w:lang w:val="fr-FR"/>
         </w:rPr>
-        <w:t xml:space="preserve"> </w:t>
-      </w:r>
-      <w:r>
-        <w:rPr>
-          <w:sz w:val="14"/>
-          <w:szCs w:val="14"/>
-          <w:lang w:val="fr-FR"/>
-        </w:rPr>
-        <w:t xml:space="preserve">agissant en qualité de gérant de la société </w:t>
+        <w:t xml:space="preserve"/>
+      </w:r>
+      <w:r>
+        <w:rPr>
+          <w:sz w:val="14"/>
+          <w:szCs w:val="14"/>
+          <w:lang w:val="fr-FR"/>
+        </w:rPr>
+        <w:t xml:space="preserve"/>
       </w:r>
       <w:r>
         <w:rPr>
@@ -3819,23 +3819,23 @@
           <w:szCs w:val="14"/>
           <w:lang w:val="fr-FR"/>
         </w:rPr>
-        <w:t>« {{DEN_STE}} {{FORME_JUR}} »</w:t>
-      </w:r>
-      <w:r>
-        <w:rPr>
-          <w:sz w:val="14"/>
-          <w:szCs w:val="14"/>
-          <w:lang w:val="fr-FR"/>
-        </w:rPr>
-        <w:t xml:space="preserve">, </w:t>
-      </w:r>
-      <w:r>
-        <w:rPr>
-          <w:sz w:val="14"/>
-          <w:szCs w:val="14"/>
-          <w:lang w:val="fr-FR"/>
-        </w:rPr>
-        <w:t xml:space="preserve">donne procuration à la Société </w:t>
+        <w:t/>
+      </w:r>
+      <w:r>
+        <w:rPr>
+          <w:sz w:val="14"/>
+          <w:szCs w:val="14"/>
+          <w:lang w:val="fr-FR"/>
+        </w:rPr>
+        <w:t xml:space="preserve"/>
+      </w:r>
+      <w:r>
+        <w:rPr>
+          <w:sz w:val="14"/>
+          <w:szCs w:val="14"/>
+          <w:lang w:val="fr-FR"/>
+        </w:rPr>
+        <w:t xml:space="preserve"/>
       </w:r>
       <w:r>
         <w:rPr>
@@ -3846,7 +3846,7 @@
           <w:szCs w:val="14"/>
           <w:lang w:val="fr-FR"/>
         </w:rPr>
-        <w:t xml:space="preserve">« </w:t>
+        <w:t xml:space="preserve"/>
       </w:r>
       <w:r>
         <w:rPr>
@@ -3857,7 +3857,7 @@
           <w:szCs w:val="14"/>
           <w:lang w:val="fr-FR"/>
         </w:rPr>
-        <w:t>CENTIRIO SARLAU</w:t>
+        <w:t/>
       </w:r>
       <w:r>
         <w:rPr>
@@ -3868,7 +3868,7 @@
           <w:szCs w:val="14"/>
           <w:lang w:val="fr-FR"/>
         </w:rPr>
-        <w:t xml:space="preserve"> »</w:t>
+        <w:t xml:space="preserve"/>
       </w:r>
       <w:r>
         <w:rPr>
@@ -3877,15 +3877,15 @@
           <w:szCs w:val="14"/>
           <w:lang w:val="fr-FR"/>
         </w:rPr>
-        <w:t xml:space="preserve">, </w:t>
-      </w:r>
-      <w:r>
-        <w:rPr>
-          <w:sz w:val="14"/>
-          <w:szCs w:val="14"/>
-          <w:lang w:val="fr-FR"/>
-        </w:rPr>
-        <w:t xml:space="preserve">pour   la   réception   de   tous   courriers   ou   notifications   au   nom   de   la   société </w:t>
+        <w:t xml:space="preserve"/>
+      </w:r>
+      <w:r>
+        <w:rPr>
+          <w:sz w:val="14"/>
+          <w:szCs w:val="14"/>
+          <w:lang w:val="fr-FR"/>
+        </w:rPr>
+        <w:t xml:space="preserve"/>
       </w:r>
       <w:r>
         <w:rPr>
@@ -3896,7 +3896,7 @@
           <w:szCs w:val="14"/>
           <w:lang w:val="fr-FR"/>
         </w:rPr>
-        <w:t>{{DEN_STE}} {{FORME_JUR}}.</w:t>
+        <w:t/>
       </w:r>
     </w:p>
     <w:p>
@@ -4391,7 +4391,7 @@
                                 <w:szCs w:val="16"/>
                                 <w:lang w:val="fr-FR"/>
                               </w:rPr>
-                              <w:t xml:space="preserve">{{DEN_STE}} {{FORME_JUR}} </w:t>
+                              <w:t xml:space="preserve">{{DEN_STE}} {{FORME_JUR}} représentée par {{ ASSOCIE_CIVILITE }} {{PRENOM}} {{NOM}}{{DEN_STE}} {{FORME_JUR}} représentée par {{ ASSOCIE_CIVILITE }} {{PRENOM}} {{NOM}}</w:t>
                             </w:r>
                             <w:r>
                               <w:rPr>
@@ -4399,7 +4399,7 @@
                                 <w:szCs w:val="16"/>
                                 <w:lang w:val="fr-FR"/>
                               </w:rPr>
-                              <w:t xml:space="preserve">représentée par </w:t>
+                              <w:t xml:space="preserve"/>
                             </w:r>
                             <w:r>
                               <w:rPr>
@@ -4410,7 +4410,7 @@
                                 <w:szCs w:val="16"/>
                                 <w:lang w:val="fr-FR"/>
                               </w:rPr>
-                              <w:t>{{CIVIL}} {{PRENOM}} {{NOM}}</w:t>
+                              <w:t/>
                             </w:r>
                           </w:p>
                         </w:txbxContent>
@@ -4456,7 +4456,7 @@
                           <w:szCs w:val="16"/>
                           <w:lang w:val="fr-FR"/>
                         </w:rPr>
-                        <w:t xml:space="preserve">{{DEN_STE}} {{FORME_JUR}} </w:t>
+                        <w:t xml:space="preserve"/>
                       </w:r>
                       <w:r>
                         <w:rPr>
@@ -4464,7 +4464,7 @@
                           <w:szCs w:val="16"/>
                           <w:lang w:val="fr-FR"/>
                         </w:rPr>
-                        <w:t xml:space="preserve">représentée par </w:t>
+                        <w:t xml:space="preserve"/>
                       </w:r>
                       <w:r>
                         <w:rPr>
@@ -4475,7 +4475,7 @@
                           <w:szCs w:val="16"/>
                           <w:lang w:val="fr-FR"/>
                         </w:rPr>
-                        <w:t>{{CIVIL}} {{PRENOM}} {{NOM}}</w:t>
+                        <w:t/>
                       </w:r>
                     </w:p>
                   </w:txbxContent>

</xml_diff>

<commit_message>
chore: clean root dir - move txt/png to docs/, add gitignore rules, document convention
</commit_message>
<xml_diff>
--- a/templates/_Racine-Actifs/2026-02_Modèle_FUDBASMA_Contrat_domiciliation.docx
+++ b/templates/_Racine-Actifs/2026-02_Modèle_FUDBASMA_Contrat_domiciliation.docx
@@ -782,23 +782,23 @@
           <w:szCs w:val="14"/>
           <w:lang w:val="fr-FR"/>
         </w:rPr>
-        <w:t>ET,</w:t>
-      </w:r>
-      <w:r>
-        <w:rPr>
-          <w:sz w:val="14"/>
-          <w:szCs w:val="14"/>
-          <w:lang w:val="fr-FR"/>
-        </w:rPr>
-        <w:t xml:space="preserve"> </w:t>
-      </w:r>
-      <w:r>
-        <w:rPr>
-          <w:sz w:val="14"/>
-          <w:szCs w:val="14"/>
-          <w:lang w:val="fr-FR"/>
-        </w:rPr>
-        <w:t xml:space="preserve">La   Société </w:t>
+        <w:t>ET, La   Société « {{ SOCIETE_RAISON_SOCIALE }} {{ SOCIETE_FORME_JURIDIQUE }} », en   cours   de   formation, inscrite   à   l’ICE   sous   le   N° {{ SOCIETE_ICE }}, représentée par son Gérant : </w:t>
+      </w:r>
+      <w:r>
+        <w:rPr>
+          <w:sz w:val="14"/>
+          <w:szCs w:val="14"/>
+          <w:lang w:val="fr-FR"/>
+        </w:rPr>
+        <w:t xml:space="preserve"/>
+      </w:r>
+      <w:r>
+        <w:rPr>
+          <w:sz w:val="14"/>
+          <w:szCs w:val="14"/>
+          <w:lang w:val="fr-FR"/>
+        </w:rPr>
+        <w:t xml:space="preserve"/>
       </w:r>
       <w:r>
         <w:rPr>
@@ -809,15 +809,15 @@
           <w:szCs w:val="14"/>
           <w:lang w:val="fr-FR"/>
         </w:rPr>
-        <w:t>« {{DEN_STE}} {{FORME_JUR}} »</w:t>
-      </w:r>
-      <w:r>
-        <w:rPr>
-          <w:sz w:val="14"/>
-          <w:szCs w:val="14"/>
-          <w:lang w:val="fr-FR"/>
-        </w:rPr>
-        <w:t xml:space="preserve">, en   cours   de   formation, inscrite   à   l’ICE   sous   le   </w:t>
+        <w:t/>
+      </w:r>
+      <w:r>
+        <w:rPr>
+          <w:sz w:val="14"/>
+          <w:szCs w:val="14"/>
+          <w:lang w:val="fr-FR"/>
+        </w:rPr>
+        <w:t xml:space="preserve"/>
       </w:r>
       <w:r>
         <w:rPr>
@@ -828,7 +828,7 @@
           <w:szCs w:val="14"/>
           <w:lang w:val="fr-FR"/>
         </w:rPr>
-        <w:t xml:space="preserve">N° </w:t>
+        <w:t xml:space="preserve"/>
       </w:r>
       <w:r>
         <w:rPr>
@@ -839,7 +839,7 @@
           <w:szCs w:val="14"/>
           <w:lang w:val="fr-FR"/>
         </w:rPr>
-        <w:t>{{ICE}}</w:t>
+        <w:t/>
       </w:r>
       <w:r>
         <w:rPr>
@@ -848,23 +848,23 @@
           <w:szCs w:val="14"/>
           <w:lang w:val="fr-FR"/>
         </w:rPr>
-        <w:t xml:space="preserve">, </w:t>
-      </w:r>
-      <w:r>
-        <w:rPr>
-          <w:sz w:val="14"/>
-          <w:szCs w:val="14"/>
-          <w:lang w:val="fr-FR"/>
-        </w:rPr>
-        <w:t>représentée par son Gérant</w:t>
-      </w:r>
-      <w:r>
-        <w:rPr>
-          <w:sz w:val="14"/>
-          <w:szCs w:val="14"/>
-          <w:lang w:val="fr-FR"/>
-        </w:rPr>
-        <w:t xml:space="preserve"> : </w:t>
+        <w:t xml:space="preserve"/>
+      </w:r>
+      <w:r>
+        <w:rPr>
+          <w:sz w:val="14"/>
+          <w:szCs w:val="14"/>
+          <w:lang w:val="fr-FR"/>
+        </w:rPr>
+        <w:t/>
+      </w:r>
+      <w:r>
+        <w:rPr>
+          <w:sz w:val="14"/>
+          <w:szCs w:val="14"/>
+          <w:lang w:val="fr-FR"/>
+        </w:rPr>
+        <w:t xml:space="preserve"/>
       </w:r>
     </w:p>
     <w:tbl>
@@ -927,7 +927,7 @@
                 <w:szCs w:val="14"/>
                 <w:lang w:val="fr-FR"/>
               </w:rPr>
-              <w:t>{{PRENOM}} {{NOM}}</w:t>
+              <w:t>{{ ASSOCIE_PRENOM }} {{ ASSOCIE_NOM }}</w:t>
             </w:r>
           </w:p>
         </w:tc>
@@ -982,7 +982,7 @@
                 <w:szCs w:val="14"/>
                 <w:lang w:val="fr-FR"/>
               </w:rPr>
-              <w:t>{{DATE_NAISS}}</w:t>
+              <w:t>{{ ASSOCIE_DATE_NAISSANCE }}</w:t>
             </w:r>
           </w:p>
         </w:tc>
@@ -1037,7 +1037,7 @@
                 <w:szCs w:val="14"/>
                 <w:lang w:val="fr-FR"/>
               </w:rPr>
-              <w:t>{{</w:t>
+              <w:t>{{ ASSOCIE_NATIONALITE }}</w:t>
             </w:r>
             <w:r>
               <w:rPr>
@@ -1045,7 +1045,7 @@
                 <w:szCs w:val="14"/>
                 <w:lang w:val="fr-FR"/>
               </w:rPr>
-              <w:t>NATIONALITY</w:t>
+              <w:t/>
             </w:r>
             <w:r>
               <w:rPr>
@@ -1053,7 +1053,7 @@
                 <w:szCs w:val="14"/>
                 <w:lang w:val="fr-FR"/>
               </w:rPr>
-              <w:t>}}</w:t>
+              <w:t/>
             </w:r>
           </w:p>
         </w:tc>
@@ -1193,7 +1193,7 @@
                 <w:szCs w:val="14"/>
                 <w:lang w:val="fr-FR"/>
               </w:rPr>
-              <w:t>{{GERANT_ADRESS}}</w:t>
+              <w:t>{{ ASSOCIE_ADRESSE }}</w:t>
             </w:r>
           </w:p>
         </w:tc>
@@ -1248,7 +1248,7 @@
                 <w:szCs w:val="14"/>
                 <w:lang w:val="fr-FR"/>
               </w:rPr>
-              <w:t>{{</w:t>
+              <w:t>{{ ASSOCIE_QUALITE }}</w:t>
             </w:r>
             <w:r>
               <w:rPr>
@@ -1256,7 +1256,7 @@
                 <w:szCs w:val="14"/>
                 <w:lang w:val="fr-FR"/>
               </w:rPr>
-              <w:t>GERANT_QUALITY</w:t>
+              <w:t/>
             </w:r>
             <w:r>
               <w:rPr>
@@ -1264,7 +1264,7 @@
                 <w:szCs w:val="14"/>
                 <w:lang w:val="fr-FR"/>
               </w:rPr>
-              <w:t>}}</w:t>
+              <w:t/>
             </w:r>
           </w:p>
         </w:tc>
@@ -1319,7 +1319,7 @@
                 <w:szCs w:val="14"/>
                 <w:lang w:val="fr-FR"/>
               </w:rPr>
-              <w:t>{{GERANT_PHONE}}</w:t>
+              <w:t>{{ ASSOCIE_TELEPHONE }}</w:t>
             </w:r>
           </w:p>
         </w:tc>
@@ -1387,7 +1387,7 @@
                 <w:szCs w:val="14"/>
                 <w:lang w:val="fr-FR"/>
               </w:rPr>
-              <w:t>{{GERANT_</w:t>
+              <w:t>{{ ASSOCIE_EMAIL }}</w:t>
             </w:r>
             <w:proofErr w:type="gramStart"/>
             <w:r>
@@ -1396,7 +1396,7 @@
                 <w:szCs w:val="14"/>
                 <w:lang w:val="fr-FR"/>
               </w:rPr>
-              <w:t>EMAIL</w:t>
+              <w:t/>
             </w:r>
             <w:proofErr w:type="gramEnd"/>
             <w:r>
@@ -1405,7 +1405,7 @@
                 <w:szCs w:val="14"/>
                 <w:lang w:val="fr-FR"/>
               </w:rPr>
-              <w:t>}}</w:t>
+              <w:t/>
             </w:r>
           </w:p>
         </w:tc>
@@ -1566,7 +1566,7 @@
           <w:szCs w:val="14"/>
           <w:lang w:val="fr-FR"/>
         </w:rPr>
-        <w:t xml:space="preserve">Le présent contrat est conclu pour la domiciliation du siège de la société </w:t>
+        <w:t xml:space="preserve">Le présent contrat est conclu pour la domiciliation du siège de la société {{ SOCIETE_RAISON_SOCIALE }} {{ SOCIETE_FORME_JURIDIQUE }}, en cours de formation, titulaire de l’ICE N° N° {{ SOCIETE_ICE }}, en application des dispositions de l’article 2.544 de la loi 15.95 portant code de commerce.</w:t>
       </w:r>
       <w:r>
         <w:rPr>
@@ -1577,7 +1577,7 @@
           <w:szCs w:val="14"/>
           <w:lang w:val="fr-FR"/>
         </w:rPr>
-        <w:t>{{DEN_STE}} {{FORME_JUR}},</w:t>
+        <w:t/>
       </w:r>
       <w:r>
         <w:rPr>
@@ -1586,15 +1586,15 @@
           <w:szCs w:val="14"/>
           <w:lang w:val="fr-FR"/>
         </w:rPr>
-        <w:t xml:space="preserve"> </w:t>
-      </w:r>
-      <w:r>
-        <w:rPr>
-          <w:sz w:val="14"/>
-          <w:szCs w:val="14"/>
-          <w:lang w:val="fr-FR"/>
-        </w:rPr>
-        <w:t xml:space="preserve">en cours de formation, titulaire de l’ICE N° N° </w:t>
+        <w:t xml:space="preserve"/>
+      </w:r>
+      <w:r>
+        <w:rPr>
+          <w:sz w:val="14"/>
+          <w:szCs w:val="14"/>
+          <w:lang w:val="fr-FR"/>
+        </w:rPr>
+        <w:t xml:space="preserve"/>
       </w:r>
       <w:r>
         <w:rPr>
@@ -1605,7 +1605,7 @@
           <w:szCs w:val="14"/>
           <w:lang w:val="fr-FR"/>
         </w:rPr>
-        <w:t>{{ICE}},</w:t>
+        <w:t/>
       </w:r>
       <w:r>
         <w:rPr>
@@ -1614,15 +1614,15 @@
           <w:szCs w:val="14"/>
           <w:lang w:val="fr-FR"/>
         </w:rPr>
-        <w:t xml:space="preserve"> </w:t>
-      </w:r>
-      <w:r>
-        <w:rPr>
-          <w:sz w:val="14"/>
-          <w:szCs w:val="14"/>
-          <w:lang w:val="fr-FR"/>
-        </w:rPr>
-        <w:t>en application des dispositions de l’article 2.544 de la loi 15.95 portant code de commerce.</w:t>
+        <w:t xml:space="preserve"/>
+      </w:r>
+      <w:r>
+        <w:rPr>
+          <w:sz w:val="14"/>
+          <w:szCs w:val="14"/>
+          <w:lang w:val="fr-FR"/>
+        </w:rPr>
+        <w:t/>
       </w:r>
     </w:p>
     <w:p>
@@ -2677,7 +2677,7 @@
           <w:szCs w:val="14"/>
           <w:lang w:val="fr-FR"/>
         </w:rPr>
-        <w:t xml:space="preserve">Le présent contrat est prévu pour une durée de : </w:t>
+        <w:t xml:space="preserve">Le présent contrat est prévu pour une durée de : {{ CONTRAT_DUREE_MOIS }} Mois du {{ CONTRAT_DATE_DEBUT }} au {{ CONTRAT_DATE_FIN }}, renouvelable par tacite reconduction. A l’expiration de la durée du contrat de domiciliation ou en cas de sa rupture anticipée, le domicilié et le domiciliataire s’engagent, conformément au paragraphe 1 et 2 de l’article 3 du présent contrat à informer le secrétariat greffe du tribunal compétent du lieu d’activité et l’administration des impôts, la trésorerie générale des impôts et le cas échéant, l’administration des douanes de l'arrêt de la domiciliation, dans un délai d’un mois à partir de la date de l’arrêt du contrat</w:t>
       </w:r>
       <w:r>
         <w:rPr>
@@ -2688,7 +2688,7 @@
           <w:szCs w:val="14"/>
           <w:lang w:val="fr-FR"/>
         </w:rPr>
-        <w:t>{{PERIOD_DOMCIL}}</w:t>
+        <w:t/>
       </w:r>
       <w:r>
         <w:rPr>
@@ -2697,15 +2697,15 @@
           <w:szCs w:val="14"/>
           <w:lang w:val="fr-FR"/>
         </w:rPr>
-        <w:t xml:space="preserve"> </w:t>
-      </w:r>
-      <w:r>
-        <w:rPr>
-          <w:sz w:val="14"/>
-          <w:szCs w:val="14"/>
-          <w:lang w:val="fr-FR"/>
-        </w:rPr>
-        <w:t xml:space="preserve">Mois du </w:t>
+        <w:t xml:space="preserve"/>
+      </w:r>
+      <w:r>
+        <w:rPr>
+          <w:sz w:val="14"/>
+          <w:szCs w:val="14"/>
+          <w:lang w:val="fr-FR"/>
+        </w:rPr>
+        <w:t xml:space="preserve"/>
       </w:r>
       <w:r>
         <w:rPr>
@@ -2716,7 +2716,7 @@
           <w:szCs w:val="14"/>
           <w:lang w:val="fr-FR"/>
         </w:rPr>
-        <w:t>{{DOM_DATEDEB}}</w:t>
+        <w:t/>
       </w:r>
       <w:r>
         <w:rPr>
@@ -2725,15 +2725,15 @@
           <w:szCs w:val="14"/>
           <w:lang w:val="fr-FR"/>
         </w:rPr>
-        <w:t xml:space="preserve"> </w:t>
-      </w:r>
-      <w:r>
-        <w:rPr>
-          <w:sz w:val="14"/>
-          <w:szCs w:val="14"/>
-          <w:lang w:val="fr-FR"/>
-        </w:rPr>
-        <w:t xml:space="preserve">au </w:t>
+        <w:t xml:space="preserve"/>
+      </w:r>
+      <w:r>
+        <w:rPr>
+          <w:sz w:val="14"/>
+          <w:szCs w:val="14"/>
+          <w:lang w:val="fr-FR"/>
+        </w:rPr>
+        <w:t xml:space="preserve"/>
       </w:r>
       <w:r>
         <w:rPr>
@@ -2744,7 +2744,7 @@
           <w:szCs w:val="14"/>
           <w:lang w:val="fr-FR"/>
         </w:rPr>
-        <w:t>{{DOM_DATEFIN}}</w:t>
+        <w:t/>
       </w:r>
       <w:r>
         <w:rPr>
@@ -2755,7 +2755,7 @@
           <w:szCs w:val="16"/>
           <w:lang w:val="fr-FR"/>
         </w:rPr>
-        <w:t>,</w:t>
+        <w:t/>
       </w:r>
       <w:r>
         <w:rPr>
@@ -2764,6 +2764,111 @@
           <w:szCs w:val="16"/>
           <w:lang w:val="fr-FR"/>
         </w:rPr>
+        <w:t xml:space="preserve"/>
+      </w:r>
+      <w:r>
+        <w:rPr>
+          <w:b/>
+          <w:bCs/>
+          <w:sz w:val="14"/>
+          <w:szCs w:val="14"/>
+          <w:u w:val="single"/>
+          <w:lang w:val="fr-FR"/>
+        </w:rPr>
+        <w:t/>
+      </w:r>
+      <w:r>
+        <w:rPr>
+          <w:sz w:val="14"/>
+          <w:szCs w:val="14"/>
+          <w:lang w:val="fr-FR"/>
+        </w:rPr>
+        <w:t xml:space="preserve"/>
+      </w:r>
+      <w:r>
+        <w:rPr>
+          <w:b/>
+          <w:bCs/>
+          <w:sz w:val="14"/>
+          <w:szCs w:val="14"/>
+          <w:u w:val="single"/>
+          <w:lang w:val="fr-FR"/>
+        </w:rPr>
+        <w:t/>
+      </w:r>
+    </w:p>
+    <w:p>
+      <w:pPr>
+        <w:jc w:val="both"/>
+        <w:rPr>
+          <w:b/>
+          <w:bCs/>
+          <w:sz w:val="14"/>
+          <w:szCs w:val="14"/>
+          <w:u w:val="single"/>
+          <w:lang w:val="fr-FR"/>
+        </w:rPr>
+      </w:pPr>
+      <w:r>
+        <w:rPr>
+          <w:b/>
+          <w:bCs/>
+          <w:sz w:val="14"/>
+          <w:szCs w:val="14"/>
+          <w:u w:val="single"/>
+          <w:lang w:val="fr-FR"/>
+        </w:rPr>
+        <w:t>ARTICLE 5 : LOYER</w:t>
+      </w:r>
+    </w:p>
+    <w:p>
+      <w:pPr>
+        <w:jc w:val="both"/>
+        <w:rPr>
+          <w:sz w:val="14"/>
+          <w:szCs w:val="14"/>
+          <w:lang w:val="fr-FR"/>
+        </w:rPr>
+      </w:pPr>
+      <w:r>
+        <w:rPr>
+          <w:sz w:val="14"/>
+          <w:szCs w:val="14"/>
+          <w:lang w:val="fr-FR"/>
+        </w:rPr>
+        <w:t xml:space="preserve">Le présent contrat de domiciliation est conclu moyennant un </w:t>
+      </w:r>
+      <w:r>
+        <w:rPr>
+          <w:b/>
+          <w:bCs/>
+          <w:sz w:val="14"/>
+          <w:szCs w:val="14"/>
+          <w:u w:val="single"/>
+          <w:lang w:val="fr-FR"/>
+        </w:rPr>
+        <w:t xml:space="preserve">loyer mensuel de </w:t>
+      </w:r>
+      <w:r>
+        <w:rPr>
+          <w:b/>
+          <w:bCs/>
+          <w:sz w:val="14"/>
+          <w:szCs w:val="14"/>
+          <w:u w:val="single"/>
+          <w:lang w:val="fr-FR"/>
+        </w:rPr>
+        <w:t>104.17</w:t>
+      </w:r>
+      <w:r>
+        <w:rPr>
+          <w:b/>
+          <w:bCs/>
+          <w:sz w:val="14"/>
+          <w:szCs w:val="14"/>
+          <w:u w:val="single"/>
+          <w:lang w:val="fr-FR"/>
+        </w:rPr>
         <w:t xml:space="preserve"> </w:t>
       </w:r>
       <w:r>
@@ -2775,15 +2880,65 @@
           <w:u w:val="single"/>
           <w:lang w:val="fr-FR"/>
         </w:rPr>
-        <w:t>renouvelable par tacite reconduction</w:t>
-      </w:r>
-      <w:r>
-        <w:rPr>
-          <w:sz w:val="14"/>
-          <w:szCs w:val="14"/>
-          <w:lang w:val="fr-FR"/>
-        </w:rPr>
-        <w:t xml:space="preserve">. A l’expiration de la durée du contrat de domiciliation ou en cas de sa rupture anticipée, le domicilié et le domiciliataire s’engagent, conformément au paragraphe 1 et 2 de l’article 3 du présent contrat à informer le secrétariat greffe du tribunal compétent du lieu d’activité et l’administration des impôts, la trésorerie générale des impôts et le cas échéant, l’administration des douanes de l'arrêt de la domiciliation, </w:t>
+        <w:t>HT (hors taxes)</w:t>
+      </w:r>
+      <w:r>
+        <w:rPr>
+          <w:sz w:val="14"/>
+          <w:szCs w:val="14"/>
+          <w:lang w:val="fr-FR"/>
+        </w:rPr>
+        <w:t xml:space="preserve"> </w:t>
+      </w:r>
+      <w:r>
+        <w:rPr>
+          <w:sz w:val="14"/>
+          <w:szCs w:val="14"/>
+          <w:lang w:val="fr-FR"/>
+        </w:rPr>
+        <w:t>comprend tous les services de l’article 2 du présent contrat.</w:t>
+      </w:r>
+    </w:p>
+    <w:p>
+      <w:pPr>
+        <w:jc w:val="both"/>
+        <w:rPr>
+          <w:sz w:val="14"/>
+          <w:szCs w:val="14"/>
+          <w:lang w:val="fr-FR"/>
+        </w:rPr>
+      </w:pPr>
+      <w:r>
+        <w:rPr>
+          <w:sz w:val="14"/>
+          <w:szCs w:val="14"/>
+          <w:lang w:val="fr-FR"/>
+        </w:rPr>
+        <w:t xml:space="preserve">Conformément aux dispositions du Code de commerce marocain et à la réglementation en vigueur, le montant du loyer initial est applicable pour la période spécifiée dans le contrat. À l’issue de cette période, et sauf résiliation du présent contrat par l’une ou l’autre des parties conformément à l’article </w:t>
+      </w:r>
+      <w:r>
+        <w:rPr>
+          <w:sz w:val="14"/>
+          <w:szCs w:val="14"/>
+          <w:lang w:val="fr-FR"/>
+        </w:rPr>
+        <w:t>7</w:t>
+      </w:r>
+      <w:r>
+        <w:rPr>
+          <w:sz w:val="14"/>
+          <w:szCs w:val="14"/>
+          <w:lang w:val="fr-FR"/>
+        </w:rPr>
+        <w:t xml:space="preserve">, </w:t>
+      </w:r>
+      <w:r>
+        <w:rPr>
+          <w:sz w:val="14"/>
+          <w:szCs w:val="14"/>
+          <w:lang w:val="fr-FR"/>
+        </w:rPr>
+        <w:t xml:space="preserve">le domiciliataire s’engage à régler le loyer annuel par anticipation. Le montant annuel sera calculé sur </w:t>
       </w:r>
       <w:r>
         <w:rPr>
@@ -2794,12 +2949,9 @@
           <w:u w:val="single"/>
           <w:lang w:val="fr-FR"/>
         </w:rPr>
-        <w:t>dans un délai d’un mois à partir de la date de l’arrêt du contrat</w:t>
-      </w:r>
-    </w:p>
-    <w:p>
-      <w:pPr>
-        <w:jc w:val="both"/>
+        <w:t xml:space="preserve">la base de </w:t>
+      </w:r>
+      <w:r>
         <w:rPr>
           <w:b/>
           <w:bCs/>
@@ -2808,7 +2960,8 @@
           <w:u w:val="single"/>
           <w:lang w:val="fr-FR"/>
         </w:rPr>
-      </w:pPr>
+        <w:t>200</w:t>
+      </w:r>
       <w:r>
         <w:rPr>
           <w:b/>
@@ -2818,25 +2971,7 @@
           <w:u w:val="single"/>
           <w:lang w:val="fr-FR"/>
         </w:rPr>
-        <w:t>ARTICLE 5 : LOYER</w:t>
-      </w:r>
-    </w:p>
-    <w:p>
-      <w:pPr>
-        <w:jc w:val="both"/>
-        <w:rPr>
-          <w:sz w:val="14"/>
-          <w:szCs w:val="14"/>
-          <w:lang w:val="fr-FR"/>
-        </w:rPr>
-      </w:pPr>
-      <w:r>
-        <w:rPr>
-          <w:sz w:val="14"/>
-          <w:szCs w:val="14"/>
-          <w:lang w:val="fr-FR"/>
-        </w:rPr>
-        <w:t xml:space="preserve">Le présent contrat de domiciliation est conclu moyennant un </w:t>
+        <w:t xml:space="preserve"> DH HT par mois, soit </w:t>
       </w:r>
       <w:r>
         <w:rPr>
@@ -2847,7 +2982,7 @@
           <w:u w:val="single"/>
           <w:lang w:val="fr-FR"/>
         </w:rPr>
-        <w:t xml:space="preserve">loyer mensuel de </w:t>
+        <w:t>2400</w:t>
       </w:r>
       <w:r>
         <w:rPr>
@@ -2858,7 +2993,7 @@
           <w:u w:val="single"/>
           <w:lang w:val="fr-FR"/>
         </w:rPr>
-        <w:t>104.17</w:t>
+        <w:t xml:space="preserve"> DH HT par </w:t>
       </w:r>
       <w:r>
         <w:rPr>
@@ -2869,77 +3004,613 @@
           <w:u w:val="single"/>
           <w:lang w:val="fr-FR"/>
         </w:rPr>
+        <w:t>an</w:t>
+      </w:r>
+      <w:r>
+        <w:rPr>
+          <w:sz w:val="14"/>
+          <w:szCs w:val="14"/>
+          <w:lang w:val="fr-FR"/>
+        </w:rPr>
+        <w:t>, payable en une seule échéance au début de chaque année contractuelle</w:t>
+      </w:r>
+      <w:r>
+        <w:rPr>
+          <w:sz w:val="14"/>
+          <w:szCs w:val="14"/>
+          <w:lang w:val="fr-FR"/>
+        </w:rPr>
+        <w:t>.</w:t>
+      </w:r>
+    </w:p>
+    <w:p>
+      <w:pPr>
+        <w:jc w:val="both"/>
+        <w:rPr>
+          <w:sz w:val="14"/>
+          <w:szCs w:val="14"/>
+          <w:lang w:val="fr-FR"/>
+        </w:rPr>
+      </w:pPr>
+      <w:r>
+        <w:rPr>
+          <w:sz w:val="14"/>
+          <w:szCs w:val="14"/>
+          <w:lang w:val="fr-FR"/>
+        </w:rPr>
+        <w:t xml:space="preserve">Toute modification des tarifs sera notifiée par écrit avec un </w:t>
+      </w:r>
+      <w:r>
+        <w:rPr>
+          <w:b/>
+          <w:bCs/>
+          <w:sz w:val="14"/>
+          <w:szCs w:val="14"/>
+          <w:u w:val="single"/>
+          <w:lang w:val="fr-FR"/>
+        </w:rPr>
+        <w:t>préavis d’un (1) mois</w:t>
+      </w:r>
+      <w:r>
+        <w:rPr>
+          <w:sz w:val="14"/>
+          <w:szCs w:val="14"/>
+          <w:lang w:val="fr-FR"/>
+        </w:rPr>
+        <w:t>.</w:t>
+      </w:r>
+    </w:p>
+    <w:p>
+      <w:pPr>
+        <w:jc w:val="both"/>
+        <w:rPr>
+          <w:sz w:val="14"/>
+          <w:szCs w:val="14"/>
+          <w:lang w:val="fr-FR"/>
+        </w:rPr>
+      </w:pPr>
+      <w:r>
+        <w:rPr>
+          <w:sz w:val="14"/>
+          <w:szCs w:val="14"/>
+          <w:lang w:val="fr-FR"/>
+        </w:rPr>
+        <w:t>Le loyer inclut uniquement les services prévus dans le contrat, toute prestation supplémentaire sera facturée séparément.</w:t>
+      </w:r>
+    </w:p>
+    <w:p>
+      <w:pPr>
+        <w:jc w:val="both"/>
+        <w:rPr>
+          <w:b/>
+          <w:bCs/>
+          <w:sz w:val="14"/>
+          <w:szCs w:val="14"/>
+          <w:u w:val="single"/>
+          <w:lang w:val="fr-FR"/>
+        </w:rPr>
+      </w:pPr>
+      <w:r>
+        <w:rPr>
+          <w:b/>
+          <w:bCs/>
+          <w:sz w:val="14"/>
+          <w:szCs w:val="14"/>
+          <w:u w:val="single"/>
+          <w:lang w:val="fr-FR"/>
+        </w:rPr>
+        <w:t xml:space="preserve">ARTICLE </w:t>
+      </w:r>
+      <w:r>
+        <w:rPr>
+          <w:b/>
+          <w:bCs/>
+          <w:sz w:val="14"/>
+          <w:szCs w:val="14"/>
+          <w:u w:val="single"/>
+          <w:lang w:val="fr-FR"/>
+        </w:rPr>
+        <w:t>6</w:t>
+      </w:r>
+      <w:r>
+        <w:rPr>
+          <w:b/>
+          <w:bCs/>
+          <w:sz w:val="14"/>
+          <w:szCs w:val="14"/>
+          <w:u w:val="single"/>
+          <w:lang w:val="fr-FR"/>
+        </w:rPr>
+        <w:t xml:space="preserve"> : DECLARATION</w:t>
+      </w:r>
+    </w:p>
+    <w:p>
+      <w:pPr>
+        <w:jc w:val="both"/>
+        <w:rPr>
+          <w:sz w:val="14"/>
+          <w:szCs w:val="14"/>
+          <w:lang w:val="fr-FR"/>
+        </w:rPr>
+      </w:pPr>
+      <w:r>
+        <w:rPr>
+          <w:sz w:val="14"/>
+          <w:szCs w:val="14"/>
+          <w:lang w:val="fr-FR"/>
+        </w:rPr>
+        <w:t xml:space="preserve">Le signataire du présent contrat déclare, de manière expresse et sur l’honneur, Certifier l’exactitude des renseignements fournis à l’appui de la signature du présent contrat avec </w:t>
+      </w:r>
+      <w:r>
+        <w:rPr>
+          <w:b/>
+          <w:bCs/>
+          <w:color w:val="32483B"/>
+          <w:sz w:val="14"/>
+          <w:szCs w:val="14"/>
+          <w:lang w:val="fr-FR"/>
+        </w:rPr>
+        <w:t xml:space="preserve">« </w:t>
+      </w:r>
+      <w:r>
+        <w:rPr>
+          <w:b/>
+          <w:bCs/>
+          <w:color w:val="32483B"/>
+          <w:sz w:val="14"/>
+          <w:szCs w:val="14"/>
+          <w:lang w:val="fr-FR"/>
+        </w:rPr>
+        <w:t>CENTIRIO SARLAU</w:t>
+      </w:r>
+      <w:r>
+        <w:rPr>
+          <w:b/>
+          <w:bCs/>
+          <w:color w:val="32483B"/>
+          <w:sz w:val="14"/>
+          <w:szCs w:val="14"/>
+          <w:lang w:val="fr-FR"/>
+        </w:rPr>
+        <w:t xml:space="preserve"> »</w:t>
+      </w:r>
+      <w:r>
+        <w:rPr>
+          <w:color w:val="32483B"/>
+          <w:sz w:val="14"/>
+          <w:szCs w:val="14"/>
+          <w:lang w:val="fr-FR"/>
+        </w:rPr>
+        <w:t xml:space="preserve">, </w:t>
+      </w:r>
+      <w:r>
+        <w:rPr>
+          <w:sz w:val="14"/>
+          <w:szCs w:val="14"/>
+          <w:lang w:val="fr-FR"/>
+        </w:rPr>
+        <w:t>certifier ne pas être en situation de liquidation de biens, règlement judiciaire, en ce qui concerne l’entreprise ou les entreprises qu’il dirige, que ces établissements soient ou non l’objet dudit contrat.</w:t>
+      </w:r>
+    </w:p>
+    <w:p>
+      <w:pPr>
+        <w:jc w:val="both"/>
+        <w:rPr>
+          <w:sz w:val="14"/>
+          <w:szCs w:val="14"/>
+          <w:lang w:val="fr-FR"/>
+        </w:rPr>
+      </w:pPr>
+      <w:r>
+        <w:rPr>
+          <w:sz w:val="14"/>
+          <w:szCs w:val="14"/>
+          <w:lang w:val="fr-FR"/>
+        </w:rPr>
+        <w:t xml:space="preserve">Enfin, il atteste de l’exactitude de tous les renseignements fournis à </w:t>
+      </w:r>
+      <w:r>
+        <w:rPr>
+          <w:b/>
+          <w:bCs/>
+          <w:color w:val="32483B"/>
+          <w:sz w:val="14"/>
+          <w:szCs w:val="14"/>
+          <w:lang w:val="fr-FR"/>
+        </w:rPr>
+        <w:t>«</w:t>
+      </w:r>
+      <w:r>
+        <w:rPr>
+          <w:b/>
+          <w:bCs/>
+          <w:color w:val="32483B"/>
+          <w:sz w:val="14"/>
+          <w:szCs w:val="14"/>
+          <w:lang w:val="fr-FR"/>
+        </w:rPr>
+        <w:t xml:space="preserve"> CENTIRIO SARLAU</w:t>
+      </w:r>
+      <w:r>
+        <w:rPr>
+          <w:b/>
+          <w:bCs/>
+          <w:color w:val="32483B"/>
+          <w:sz w:val="14"/>
+          <w:szCs w:val="14"/>
+          <w:lang w:val="fr-FR"/>
+        </w:rPr>
+        <w:t xml:space="preserve"> »</w:t>
+      </w:r>
+      <w:r>
+        <w:rPr>
+          <w:sz w:val="14"/>
+          <w:szCs w:val="14"/>
+          <w:lang w:val="fr-FR"/>
+        </w:rPr>
+        <w:t>, tant en ce qui concerne son état-civil que l’entreprise représentée.</w:t>
+      </w:r>
+    </w:p>
+    <w:p>
+      <w:pPr>
+        <w:jc w:val="both"/>
+        <w:rPr>
+          <w:b/>
+          <w:bCs/>
+          <w:sz w:val="14"/>
+          <w:szCs w:val="14"/>
+          <w:u w:val="single"/>
+          <w:lang w:val="fr-FR"/>
+        </w:rPr>
+      </w:pPr>
+      <w:r>
+        <w:rPr>
+          <w:b/>
+          <w:bCs/>
+          <w:sz w:val="14"/>
+          <w:szCs w:val="14"/>
+          <w:u w:val="single"/>
+          <w:lang w:val="fr-FR"/>
+        </w:rPr>
+        <w:t xml:space="preserve">ARTICLE </w:t>
+      </w:r>
+      <w:r>
+        <w:rPr>
+          <w:b/>
+          <w:bCs/>
+          <w:sz w:val="14"/>
+          <w:szCs w:val="14"/>
+          <w:u w:val="single"/>
+          <w:lang w:val="fr-FR"/>
+        </w:rPr>
+        <w:t>7</w:t>
+      </w:r>
+      <w:r>
+        <w:rPr>
+          <w:b/>
+          <w:bCs/>
+          <w:sz w:val="14"/>
+          <w:szCs w:val="14"/>
+          <w:u w:val="single"/>
+          <w:lang w:val="fr-FR"/>
+        </w:rPr>
+        <w:t xml:space="preserve"> : CLAUSE RESOLUTION</w:t>
+      </w:r>
+    </w:p>
+    <w:p>
+      <w:pPr>
+        <w:jc w:val="both"/>
+        <w:rPr>
+          <w:sz w:val="14"/>
+          <w:szCs w:val="14"/>
+          <w:lang w:val="fr-FR"/>
+        </w:rPr>
+      </w:pPr>
+      <w:r>
+        <w:rPr>
+          <w:sz w:val="14"/>
+          <w:szCs w:val="14"/>
+          <w:lang w:val="fr-FR"/>
+        </w:rPr>
+        <w:t xml:space="preserve">Il est expressément stipulé qu’à défaut de paiement d’une facture à son échéance ou en cas d’inexécution constatée d’une seule des obligations du contrat, </w:t>
+      </w:r>
+      <w:r>
+        <w:rPr>
+          <w:b/>
+          <w:bCs/>
+          <w:sz w:val="14"/>
+          <w:szCs w:val="14"/>
+          <w:u w:val="single"/>
+          <w:lang w:val="fr-FR"/>
+        </w:rPr>
+        <w:t xml:space="preserve">huit jours après une lettre recommandée </w:t>
+      </w:r>
+      <w:r>
+        <w:rPr>
+          <w:sz w:val="14"/>
+          <w:szCs w:val="14"/>
+          <w:lang w:val="fr-FR"/>
+        </w:rPr>
+        <w:t>avec accusé de réception non suivie d’effet, le contrat sera résilié de plein droit.</w:t>
+      </w:r>
+    </w:p>
+    <w:p>
+      <w:pPr>
+        <w:jc w:val="both"/>
+        <w:rPr>
+          <w:sz w:val="14"/>
+          <w:szCs w:val="14"/>
+          <w:lang w:val="fr-FR"/>
+        </w:rPr>
+      </w:pPr>
+      <w:r>
+        <w:rPr>
+          <w:sz w:val="14"/>
+          <w:szCs w:val="14"/>
+          <w:lang w:val="fr-FR"/>
+        </w:rPr>
+        <w:t>Le courrier du domicilié sera alors refusé et ses appels téléphoniques rejetés. La situation sera également signalée au Registre de Commerce de Casablanca et aux services fiscaux compétents.</w:t>
+      </w:r>
+    </w:p>
+    <w:p>
+      <w:pPr>
+        <w:jc w:val="both"/>
+        <w:rPr>
+          <w:sz w:val="14"/>
+          <w:szCs w:val="14"/>
+          <w:lang w:val="fr-FR"/>
+        </w:rPr>
+      </w:pPr>
+      <w:r>
+        <w:rPr>
+          <w:sz w:val="14"/>
+          <w:szCs w:val="14"/>
+          <w:lang w:val="fr-FR"/>
+        </w:rPr>
+        <w:t xml:space="preserve">En  outre  </w:t>
+      </w:r>
+      <w:r>
+        <w:rPr>
+          <w:b/>
+          <w:bCs/>
+          <w:color w:val="32483B"/>
+          <w:sz w:val="14"/>
+          <w:szCs w:val="14"/>
+          <w:lang w:val="fr-FR"/>
+        </w:rPr>
+        <w:t xml:space="preserve">« </w:t>
+      </w:r>
+      <w:r>
+        <w:rPr>
+          <w:b/>
+          <w:bCs/>
+          <w:color w:val="32483B"/>
+          <w:sz w:val="14"/>
+          <w:szCs w:val="14"/>
+          <w:lang w:val="fr-FR"/>
+        </w:rPr>
+        <w:t>C</w:t>
+      </w:r>
+      <w:r>
+        <w:rPr>
+          <w:b/>
+          <w:bCs/>
+          <w:color w:val="32483B"/>
+          <w:sz w:val="14"/>
+          <w:szCs w:val="14"/>
+          <w:lang w:val="fr-FR"/>
+        </w:rPr>
+        <w:t>ENTIRIO</w:t>
+      </w:r>
+      <w:r>
+        <w:rPr>
+          <w:b/>
+          <w:bCs/>
+          <w:color w:val="32483B"/>
+          <w:sz w:val="14"/>
+          <w:szCs w:val="14"/>
+          <w:lang w:val="fr-FR"/>
+        </w:rPr>
+        <w:t xml:space="preserve">  SARL</w:t>
+      </w:r>
+      <w:r>
+        <w:rPr>
+          <w:b/>
+          <w:bCs/>
+          <w:color w:val="32483B"/>
+          <w:sz w:val="14"/>
+          <w:szCs w:val="14"/>
+          <w:lang w:val="fr-FR"/>
+        </w:rPr>
+        <w:t xml:space="preserve">AU </w:t>
+      </w:r>
+      <w:r>
+        <w:rPr>
+          <w:b/>
+          <w:bCs/>
+          <w:color w:val="32483B"/>
+          <w:sz w:val="14"/>
+          <w:szCs w:val="14"/>
+          <w:lang w:val="fr-FR"/>
+        </w:rPr>
+        <w:t>»</w:t>
+      </w:r>
+      <w:r>
+        <w:rPr>
+          <w:color w:val="32483B"/>
+          <w:sz w:val="14"/>
+          <w:szCs w:val="14"/>
+          <w:lang w:val="fr-FR"/>
+        </w:rPr>
+        <w:t xml:space="preserve">, </w:t>
+      </w:r>
+      <w:r>
+        <w:rPr>
+          <w:sz w:val="14"/>
+          <w:szCs w:val="14"/>
+          <w:lang w:val="fr-FR"/>
+        </w:rPr>
+        <w:t xml:space="preserve">se  réserve  la  faculté  de  faire  cesser  les effets des  contrats  dans  les  locaux  concernés  ainsi que tous les actes en découlant pour le domicilié, sur simple lettre recommandée avec accusé de réception avec effet immédiat dans le cas où le domicilié, créerait des troubles commerciaux ou non, pour la bonne marche et la bonne réputation des locaux et, de manière générales, tous usages contraires à l’ordre public et aux bonnes mœurs (défaut de paiement de ses fournisseurs ou tout créancier, plainte des salariés, action de l’inspection du </w:t>
+      </w:r>
+      <w:r>
+        <w:rPr>
+          <w:sz w:val="14"/>
+          <w:szCs w:val="14"/>
+          <w:lang w:val="fr-FR"/>
+        </w:rPr>
+        <w:t>travail, visite des services de police le  concernant  ou  visite d’huissiers à sa recherche,…). Tous les frais d’une telle situation et ceux qui en seraient la suite ou la conséquence seront à la charge du domicilié qui s’oblige à les régler.</w:t>
+      </w:r>
+    </w:p>
+    <w:p>
+      <w:pPr>
+        <w:jc w:val="both"/>
+        <w:rPr>
+          <w:sz w:val="14"/>
+          <w:szCs w:val="14"/>
+          <w:lang w:val="fr-FR"/>
+        </w:rPr>
+      </w:pPr>
+      <w:r>
+        <w:rPr>
+          <w:sz w:val="14"/>
+          <w:szCs w:val="14"/>
+          <w:lang w:val="fr-FR"/>
+        </w:rPr>
+        <w:t xml:space="preserve">Le domicilié devra, en outre, rembourser à </w:t>
+      </w:r>
+      <w:r>
+        <w:rPr>
+          <w:b/>
+          <w:bCs/>
+          <w:color w:val="32483B"/>
+          <w:sz w:val="14"/>
+          <w:szCs w:val="14"/>
+          <w:lang w:val="fr-FR"/>
+        </w:rPr>
+        <w:t xml:space="preserve">« </w:t>
+      </w:r>
+      <w:r>
+        <w:rPr>
+          <w:b/>
+          <w:bCs/>
+          <w:color w:val="32483B"/>
+          <w:sz w:val="14"/>
+          <w:szCs w:val="14"/>
+          <w:lang w:val="fr-FR"/>
+        </w:rPr>
+        <w:t>CENTIRIO SARLAU</w:t>
+      </w:r>
+      <w:r>
+        <w:rPr>
+          <w:b/>
+          <w:bCs/>
+          <w:color w:val="32483B"/>
+          <w:sz w:val="14"/>
+          <w:szCs w:val="14"/>
+          <w:lang w:val="fr-FR"/>
+        </w:rPr>
+        <w:t xml:space="preserve"> »</w:t>
+      </w:r>
+      <w:r>
+        <w:rPr>
+          <w:color w:val="124F1A" w:themeColor="accent3" w:themeShade="BF"/>
+          <w:sz w:val="14"/>
+          <w:szCs w:val="14"/>
+          <w:lang w:val="fr-FR"/>
+        </w:rPr>
+        <w:t xml:space="preserve">, </w:t>
+      </w:r>
+      <w:r>
+        <w:rPr>
+          <w:sz w:val="14"/>
+          <w:szCs w:val="14"/>
+          <w:lang w:val="fr-FR"/>
+        </w:rPr>
+        <w:t>les frais des actes extra-judiciaires et autres frais de justice motivés par des infractions aux clauses et aux conditions du présent engagement.</w:t>
+      </w:r>
+    </w:p>
+    <w:p>
+      <w:pPr>
+        <w:jc w:val="both"/>
+        <w:rPr>
+          <w:sz w:val="14"/>
+          <w:szCs w:val="14"/>
+          <w:lang w:val="fr-FR"/>
+        </w:rPr>
+      </w:pPr>
+      <w:r>
+        <w:rPr>
+          <w:sz w:val="14"/>
+          <w:szCs w:val="14"/>
+          <w:lang w:val="fr-FR"/>
+        </w:rPr>
+        <w:t xml:space="preserve">En application de ces principes et pour le cas où le recouvrement de toutes les sommes exigibles en vertu des présentes nécessiterait l’intervention d’un huissier de justice et/ou d’un avocat, le domicilié devra également rembourser à </w:t>
+      </w:r>
+      <w:r>
+        <w:rPr>
+          <w:b/>
+          <w:bCs/>
+          <w:color w:val="32483B"/>
+          <w:sz w:val="14"/>
+          <w:szCs w:val="14"/>
+          <w:lang w:val="fr-FR"/>
+        </w:rPr>
+        <w:t xml:space="preserve">« </w:t>
+      </w:r>
+      <w:r>
+        <w:rPr>
+          <w:b/>
+          <w:bCs/>
+          <w:color w:val="32483B"/>
+          <w:sz w:val="14"/>
+          <w:szCs w:val="14"/>
+          <w:lang w:val="fr-FR"/>
+        </w:rPr>
+        <w:t>CENTIRIO SARLAU</w:t>
+      </w:r>
+      <w:r>
+        <w:rPr>
+          <w:b/>
+          <w:bCs/>
+          <w:color w:val="32483B"/>
+          <w:sz w:val="14"/>
+          <w:szCs w:val="14"/>
+          <w:lang w:val="fr-FR"/>
+        </w:rPr>
         <w:t xml:space="preserve"> </w:t>
       </w:r>
       <w:r>
         <w:rPr>
           <w:b/>
           <w:bCs/>
+          <w:color w:val="32483B"/>
+          <w:sz w:val="14"/>
+          <w:szCs w:val="14"/>
+          <w:lang w:val="fr-FR"/>
+        </w:rPr>
+        <w:t>»</w:t>
+      </w:r>
+      <w:r>
+        <w:rPr>
+          <w:sz w:val="14"/>
+          <w:szCs w:val="14"/>
+          <w:lang w:val="fr-FR"/>
+        </w:rPr>
+        <w:t>, les honoraires et frais de recouvrement, droit de recette ou droit proportionnel qui seraient perçus par ceux-ci.</w:t>
+      </w:r>
+    </w:p>
+    <w:p>
+      <w:pPr>
+        <w:jc w:val="both"/>
+        <w:rPr>
+          <w:b/>
+          <w:bCs/>
           <w:sz w:val="14"/>
           <w:szCs w:val="14"/>
           <w:u w:val="single"/>
           <w:lang w:val="fr-FR"/>
         </w:rPr>
-        <w:t>HT (hors taxes)</w:t>
-      </w:r>
-      <w:r>
-        <w:rPr>
-          <w:sz w:val="14"/>
-          <w:szCs w:val="14"/>
-          <w:lang w:val="fr-FR"/>
-        </w:rPr>
-        <w:t xml:space="preserve"> </w:t>
-      </w:r>
-      <w:r>
-        <w:rPr>
-          <w:sz w:val="14"/>
-          <w:szCs w:val="14"/>
-          <w:lang w:val="fr-FR"/>
-        </w:rPr>
-        <w:t>comprend tous les services de l’article 2 du présent contrat.</w:t>
-      </w:r>
-    </w:p>
-    <w:p>
-      <w:pPr>
-        <w:jc w:val="both"/>
-        <w:rPr>
-          <w:sz w:val="14"/>
-          <w:szCs w:val="14"/>
-          <w:lang w:val="fr-FR"/>
-        </w:rPr>
-      </w:pPr>
-      <w:r>
-        <w:rPr>
-          <w:sz w:val="14"/>
-          <w:szCs w:val="14"/>
-          <w:lang w:val="fr-FR"/>
-        </w:rPr>
-        <w:t xml:space="preserve">Conformément aux dispositions du Code de commerce marocain et à la réglementation en vigueur, le montant du loyer initial est applicable pour la période spécifiée dans le contrat. À l’issue de cette période, et sauf résiliation du présent contrat par l’une ou l’autre des parties conformément à l’article </w:t>
-      </w:r>
-      <w:r>
-        <w:rPr>
-          <w:sz w:val="14"/>
-          <w:szCs w:val="14"/>
-          <w:lang w:val="fr-FR"/>
-        </w:rPr>
-        <w:t>7</w:t>
-      </w:r>
-      <w:r>
-        <w:rPr>
-          <w:sz w:val="14"/>
-          <w:szCs w:val="14"/>
-          <w:lang w:val="fr-FR"/>
-        </w:rPr>
-        <w:t xml:space="preserve">, </w:t>
-      </w:r>
-      <w:r>
-        <w:rPr>
-          <w:sz w:val="14"/>
-          <w:szCs w:val="14"/>
-          <w:lang w:val="fr-FR"/>
-        </w:rPr>
-        <w:t xml:space="preserve">le domiciliataire s’engage à régler le loyer annuel par anticipation. Le montant annuel sera calculé sur </w:t>
-      </w:r>
+      </w:pPr>
       <w:r>
         <w:rPr>
           <w:b/>
@@ -2949,7 +3620,7 @@
           <w:u w:val="single"/>
           <w:lang w:val="fr-FR"/>
         </w:rPr>
-        <w:t xml:space="preserve">la base de </w:t>
+        <w:t xml:space="preserve">ARTICLE </w:t>
       </w:r>
       <w:r>
         <w:rPr>
@@ -2960,7 +3631,7 @@
           <w:u w:val="single"/>
           <w:lang w:val="fr-FR"/>
         </w:rPr>
-        <w:t>200</w:t>
+        <w:t>8</w:t>
       </w:r>
       <w:r>
         <w:rPr>
@@ -2971,9 +3642,30 @@
           <w:u w:val="single"/>
           <w:lang w:val="fr-FR"/>
         </w:rPr>
-        <w:t xml:space="preserve"> DH HT par mois, soit </w:t>
-      </w:r>
-      <w:r>
+        <w:t xml:space="preserve"> : FRAIS</w:t>
+      </w:r>
+    </w:p>
+    <w:p>
+      <w:pPr>
+        <w:jc w:val="both"/>
+        <w:rPr>
+          <w:sz w:val="14"/>
+          <w:szCs w:val="14"/>
+          <w:lang w:val="fr-FR"/>
+        </w:rPr>
+      </w:pPr>
+      <w:r>
+        <w:rPr>
+          <w:sz w:val="14"/>
+          <w:szCs w:val="14"/>
+          <w:lang w:val="fr-FR"/>
+        </w:rPr>
+        <w:t>Les frais et droits des présentes sont à la charge du domicilié.</w:t>
+      </w:r>
+    </w:p>
+    <w:p>
+      <w:pPr>
+        <w:jc w:val="both"/>
         <w:rPr>
           <w:b/>
           <w:bCs/>
@@ -2982,8 +3674,7 @@
           <w:u w:val="single"/>
           <w:lang w:val="fr-FR"/>
         </w:rPr>
-        <w:t>2400</w:t>
-      </w:r>
+      </w:pPr>
       <w:r>
         <w:rPr>
           <w:b/>
@@ -2993,7 +3684,7 @@
           <w:u w:val="single"/>
           <w:lang w:val="fr-FR"/>
         </w:rPr>
-        <w:t xml:space="preserve"> DH HT par </w:t>
+        <w:t xml:space="preserve">ARTICLE </w:t>
       </w:r>
       <w:r>
         <w:rPr>
@@ -3004,41 +3695,7 @@
           <w:u w:val="single"/>
           <w:lang w:val="fr-FR"/>
         </w:rPr>
-        <w:t>an</w:t>
-      </w:r>
-      <w:r>
-        <w:rPr>
-          <w:sz w:val="14"/>
-          <w:szCs w:val="14"/>
-          <w:lang w:val="fr-FR"/>
-        </w:rPr>
-        <w:t>, payable en une seule échéance au début de chaque année contractuelle</w:t>
-      </w:r>
-      <w:r>
-        <w:rPr>
-          <w:sz w:val="14"/>
-          <w:szCs w:val="14"/>
-          <w:lang w:val="fr-FR"/>
-        </w:rPr>
-        <w:t>.</w:t>
-      </w:r>
-    </w:p>
-    <w:p>
-      <w:pPr>
-        <w:jc w:val="both"/>
-        <w:rPr>
-          <w:sz w:val="14"/>
-          <w:szCs w:val="14"/>
-          <w:lang w:val="fr-FR"/>
-        </w:rPr>
-      </w:pPr>
-      <w:r>
-        <w:rPr>
-          <w:sz w:val="14"/>
-          <w:szCs w:val="14"/>
-          <w:lang w:val="fr-FR"/>
-        </w:rPr>
-        <w:t xml:space="preserve">Toute modification des tarifs sera notifiée par écrit avec un </w:t>
+        <w:t>9</w:t>
       </w:r>
       <w:r>
         <w:rPr>
@@ -3049,33 +3706,25 @@
           <w:u w:val="single"/>
           <w:lang w:val="fr-FR"/>
         </w:rPr>
-        <w:t>préavis d’un (1) mois</w:t>
-      </w:r>
-      <w:r>
-        <w:rPr>
-          <w:sz w:val="14"/>
-          <w:szCs w:val="14"/>
-          <w:lang w:val="fr-FR"/>
-        </w:rPr>
-        <w:t>.</w:t>
-      </w:r>
-    </w:p>
-    <w:p>
-      <w:pPr>
-        <w:jc w:val="both"/>
-        <w:rPr>
-          <w:sz w:val="14"/>
-          <w:szCs w:val="14"/>
-          <w:lang w:val="fr-FR"/>
-        </w:rPr>
-      </w:pPr>
-      <w:r>
-        <w:rPr>
-          <w:sz w:val="14"/>
-          <w:szCs w:val="14"/>
-          <w:lang w:val="fr-FR"/>
-        </w:rPr>
-        <w:t>Le loyer inclut uniquement les services prévus dans le contrat, toute prestation supplémentaire sera facturée séparément.</w:t>
+        <w:t xml:space="preserve"> : CLAUSE COMPROMISSOIRE</w:t>
+      </w:r>
+    </w:p>
+    <w:p>
+      <w:pPr>
+        <w:jc w:val="both"/>
+        <w:rPr>
+          <w:sz w:val="14"/>
+          <w:szCs w:val="14"/>
+          <w:lang w:val="fr-FR"/>
+        </w:rPr>
+      </w:pPr>
+      <w:r>
+        <w:rPr>
+          <w:sz w:val="14"/>
+          <w:szCs w:val="14"/>
+          <w:lang w:val="fr-FR"/>
+        </w:rPr>
+        <w:t>En cas de contestation ou de litige quant à l’exécution des présentes, les Parties s’entendent pour rendre le Tribunal de Casablanca seul compétent.</w:t>
       </w:r>
     </w:p>
     <w:p>
@@ -3099,7 +3748,7 @@
           <w:u w:val="single"/>
           <w:lang w:val="fr-FR"/>
         </w:rPr>
-        <w:t xml:space="preserve">ARTICLE </w:t>
+        <w:t>ARTICLE 1</w:t>
       </w:r>
       <w:r>
         <w:rPr>
@@ -3110,7 +3759,7 @@
           <w:u w:val="single"/>
           <w:lang w:val="fr-FR"/>
         </w:rPr>
-        <w:t>6</w:t>
+        <w:t>0</w:t>
       </w:r>
       <w:r>
         <w:rPr>
@@ -3121,655 +3770,6 @@
           <w:u w:val="single"/>
           <w:lang w:val="fr-FR"/>
         </w:rPr>
-        <w:t xml:space="preserve"> : DECLARATION</w:t>
-      </w:r>
-    </w:p>
-    <w:p>
-      <w:pPr>
-        <w:jc w:val="both"/>
-        <w:rPr>
-          <w:sz w:val="14"/>
-          <w:szCs w:val="14"/>
-          <w:lang w:val="fr-FR"/>
-        </w:rPr>
-      </w:pPr>
-      <w:r>
-        <w:rPr>
-          <w:sz w:val="14"/>
-          <w:szCs w:val="14"/>
-          <w:lang w:val="fr-FR"/>
-        </w:rPr>
-        <w:t xml:space="preserve">Le signataire du présent contrat déclare, de manière expresse et sur l’honneur, Certifier l’exactitude des renseignements fournis à l’appui de la signature du présent contrat avec </w:t>
-      </w:r>
-      <w:r>
-        <w:rPr>
-          <w:b/>
-          <w:bCs/>
-          <w:color w:val="32483B"/>
-          <w:sz w:val="14"/>
-          <w:szCs w:val="14"/>
-          <w:lang w:val="fr-FR"/>
-        </w:rPr>
-        <w:t xml:space="preserve">« </w:t>
-      </w:r>
-      <w:r>
-        <w:rPr>
-          <w:b/>
-          <w:bCs/>
-          <w:color w:val="32483B"/>
-          <w:sz w:val="14"/>
-          <w:szCs w:val="14"/>
-          <w:lang w:val="fr-FR"/>
-        </w:rPr>
-        <w:t>CENTIRIO SARLAU</w:t>
-      </w:r>
-      <w:r>
-        <w:rPr>
-          <w:b/>
-          <w:bCs/>
-          <w:color w:val="32483B"/>
-          <w:sz w:val="14"/>
-          <w:szCs w:val="14"/>
-          <w:lang w:val="fr-FR"/>
-        </w:rPr>
-        <w:t xml:space="preserve"> »</w:t>
-      </w:r>
-      <w:r>
-        <w:rPr>
-          <w:color w:val="32483B"/>
-          <w:sz w:val="14"/>
-          <w:szCs w:val="14"/>
-          <w:lang w:val="fr-FR"/>
-        </w:rPr>
-        <w:t xml:space="preserve">, </w:t>
-      </w:r>
-      <w:r>
-        <w:rPr>
-          <w:sz w:val="14"/>
-          <w:szCs w:val="14"/>
-          <w:lang w:val="fr-FR"/>
-        </w:rPr>
-        <w:t>certifier ne pas être en situation de liquidation de biens, règlement judiciaire, en ce qui concerne l’entreprise ou les entreprises qu’il dirige, que ces établissements soient ou non l’objet dudit contrat.</w:t>
-      </w:r>
-    </w:p>
-    <w:p>
-      <w:pPr>
-        <w:jc w:val="both"/>
-        <w:rPr>
-          <w:sz w:val="14"/>
-          <w:szCs w:val="14"/>
-          <w:lang w:val="fr-FR"/>
-        </w:rPr>
-      </w:pPr>
-      <w:r>
-        <w:rPr>
-          <w:sz w:val="14"/>
-          <w:szCs w:val="14"/>
-          <w:lang w:val="fr-FR"/>
-        </w:rPr>
-        <w:t xml:space="preserve">Enfin, il atteste de l’exactitude de tous les renseignements fournis à </w:t>
-      </w:r>
-      <w:r>
-        <w:rPr>
-          <w:b/>
-          <w:bCs/>
-          <w:color w:val="32483B"/>
-          <w:sz w:val="14"/>
-          <w:szCs w:val="14"/>
-          <w:lang w:val="fr-FR"/>
-        </w:rPr>
-        <w:t>«</w:t>
-      </w:r>
-      <w:r>
-        <w:rPr>
-          <w:b/>
-          <w:bCs/>
-          <w:color w:val="32483B"/>
-          <w:sz w:val="14"/>
-          <w:szCs w:val="14"/>
-          <w:lang w:val="fr-FR"/>
-        </w:rPr>
-        <w:t xml:space="preserve"> CENTIRIO SARLAU</w:t>
-      </w:r>
-      <w:r>
-        <w:rPr>
-          <w:b/>
-          <w:bCs/>
-          <w:color w:val="32483B"/>
-          <w:sz w:val="14"/>
-          <w:szCs w:val="14"/>
-          <w:lang w:val="fr-FR"/>
-        </w:rPr>
-        <w:t xml:space="preserve"> »</w:t>
-      </w:r>
-      <w:r>
-        <w:rPr>
-          <w:sz w:val="14"/>
-          <w:szCs w:val="14"/>
-          <w:lang w:val="fr-FR"/>
-        </w:rPr>
-        <w:t>, tant en ce qui concerne son état-civil que l’entreprise représentée.</w:t>
-      </w:r>
-    </w:p>
-    <w:p>
-      <w:pPr>
-        <w:jc w:val="both"/>
-        <w:rPr>
-          <w:b/>
-          <w:bCs/>
-          <w:sz w:val="14"/>
-          <w:szCs w:val="14"/>
-          <w:u w:val="single"/>
-          <w:lang w:val="fr-FR"/>
-        </w:rPr>
-      </w:pPr>
-      <w:r>
-        <w:rPr>
-          <w:b/>
-          <w:bCs/>
-          <w:sz w:val="14"/>
-          <w:szCs w:val="14"/>
-          <w:u w:val="single"/>
-          <w:lang w:val="fr-FR"/>
-        </w:rPr>
-        <w:t xml:space="preserve">ARTICLE </w:t>
-      </w:r>
-      <w:r>
-        <w:rPr>
-          <w:b/>
-          <w:bCs/>
-          <w:sz w:val="14"/>
-          <w:szCs w:val="14"/>
-          <w:u w:val="single"/>
-          <w:lang w:val="fr-FR"/>
-        </w:rPr>
-        <w:t>7</w:t>
-      </w:r>
-      <w:r>
-        <w:rPr>
-          <w:b/>
-          <w:bCs/>
-          <w:sz w:val="14"/>
-          <w:szCs w:val="14"/>
-          <w:u w:val="single"/>
-          <w:lang w:val="fr-FR"/>
-        </w:rPr>
-        <w:t xml:space="preserve"> : CLAUSE RESOLUTION</w:t>
-      </w:r>
-    </w:p>
-    <w:p>
-      <w:pPr>
-        <w:jc w:val="both"/>
-        <w:rPr>
-          <w:sz w:val="14"/>
-          <w:szCs w:val="14"/>
-          <w:lang w:val="fr-FR"/>
-        </w:rPr>
-      </w:pPr>
-      <w:r>
-        <w:rPr>
-          <w:sz w:val="14"/>
-          <w:szCs w:val="14"/>
-          <w:lang w:val="fr-FR"/>
-        </w:rPr>
-        <w:t xml:space="preserve">Il est expressément stipulé qu’à défaut de paiement d’une facture à son échéance ou en cas d’inexécution constatée d’une seule des obligations du contrat, </w:t>
-      </w:r>
-      <w:r>
-        <w:rPr>
-          <w:b/>
-          <w:bCs/>
-          <w:sz w:val="14"/>
-          <w:szCs w:val="14"/>
-          <w:u w:val="single"/>
-          <w:lang w:val="fr-FR"/>
-        </w:rPr>
-        <w:t xml:space="preserve">huit jours après une lettre recommandée </w:t>
-      </w:r>
-      <w:r>
-        <w:rPr>
-          <w:sz w:val="14"/>
-          <w:szCs w:val="14"/>
-          <w:lang w:val="fr-FR"/>
-        </w:rPr>
-        <w:t>avec accusé de réception non suivie d’effet, le contrat sera résilié de plein droit.</w:t>
-      </w:r>
-    </w:p>
-    <w:p>
-      <w:pPr>
-        <w:jc w:val="both"/>
-        <w:rPr>
-          <w:sz w:val="14"/>
-          <w:szCs w:val="14"/>
-          <w:lang w:val="fr-FR"/>
-        </w:rPr>
-      </w:pPr>
-      <w:r>
-        <w:rPr>
-          <w:sz w:val="14"/>
-          <w:szCs w:val="14"/>
-          <w:lang w:val="fr-FR"/>
-        </w:rPr>
-        <w:t>Le courrier du domicilié sera alors refusé et ses appels téléphoniques rejetés. La situation sera également signalée au Registre de Commerce de Casablanca et aux services fiscaux compétents.</w:t>
-      </w:r>
-    </w:p>
-    <w:p>
-      <w:pPr>
-        <w:jc w:val="both"/>
-        <w:rPr>
-          <w:sz w:val="14"/>
-          <w:szCs w:val="14"/>
-          <w:lang w:val="fr-FR"/>
-        </w:rPr>
-      </w:pPr>
-      <w:r>
-        <w:rPr>
-          <w:sz w:val="14"/>
-          <w:szCs w:val="14"/>
-          <w:lang w:val="fr-FR"/>
-        </w:rPr>
-        <w:t xml:space="preserve">En  outre  </w:t>
-      </w:r>
-      <w:r>
-        <w:rPr>
-          <w:b/>
-          <w:bCs/>
-          <w:color w:val="32483B"/>
-          <w:sz w:val="14"/>
-          <w:szCs w:val="14"/>
-          <w:lang w:val="fr-FR"/>
-        </w:rPr>
-        <w:t xml:space="preserve">« </w:t>
-      </w:r>
-      <w:r>
-        <w:rPr>
-          <w:b/>
-          <w:bCs/>
-          <w:color w:val="32483B"/>
-          <w:sz w:val="14"/>
-          <w:szCs w:val="14"/>
-          <w:lang w:val="fr-FR"/>
-        </w:rPr>
-        <w:t>C</w:t>
-      </w:r>
-      <w:r>
-        <w:rPr>
-          <w:b/>
-          <w:bCs/>
-          <w:color w:val="32483B"/>
-          <w:sz w:val="14"/>
-          <w:szCs w:val="14"/>
-          <w:lang w:val="fr-FR"/>
-        </w:rPr>
-        <w:t>ENTIRIO</w:t>
-      </w:r>
-      <w:r>
-        <w:rPr>
-          <w:b/>
-          <w:bCs/>
-          <w:color w:val="32483B"/>
-          <w:sz w:val="14"/>
-          <w:szCs w:val="14"/>
-          <w:lang w:val="fr-FR"/>
-        </w:rPr>
-        <w:t xml:space="preserve">  SARL</w:t>
-      </w:r>
-      <w:r>
-        <w:rPr>
-          <w:b/>
-          <w:bCs/>
-          <w:color w:val="32483B"/>
-          <w:sz w:val="14"/>
-          <w:szCs w:val="14"/>
-          <w:lang w:val="fr-FR"/>
-        </w:rPr>
-        <w:t xml:space="preserve">AU </w:t>
-      </w:r>
-      <w:r>
-        <w:rPr>
-          <w:b/>
-          <w:bCs/>
-          <w:color w:val="32483B"/>
-          <w:sz w:val="14"/>
-          <w:szCs w:val="14"/>
-          <w:lang w:val="fr-FR"/>
-        </w:rPr>
-        <w:t>»</w:t>
-      </w:r>
-      <w:r>
-        <w:rPr>
-          <w:color w:val="32483B"/>
-          <w:sz w:val="14"/>
-          <w:szCs w:val="14"/>
-          <w:lang w:val="fr-FR"/>
-        </w:rPr>
-        <w:t xml:space="preserve">, </w:t>
-      </w:r>
-      <w:r>
-        <w:rPr>
-          <w:sz w:val="14"/>
-          <w:szCs w:val="14"/>
-          <w:lang w:val="fr-FR"/>
-        </w:rPr>
-        <w:t xml:space="preserve">se  réserve  la  faculté  de  faire  cesser  les effets des  contrats  dans  les  locaux  concernés  ainsi que tous les actes en découlant pour le domicilié, sur simple lettre recommandée avec accusé de réception avec effet immédiat dans le cas où le domicilié, créerait des troubles commerciaux ou non, pour la bonne marche et la bonne réputation des locaux et, de manière générales, tous usages contraires à l’ordre public et aux bonnes mœurs (défaut de paiement de ses fournisseurs ou tout créancier, plainte des salariés, action de l’inspection du </w:t>
-      </w:r>
-      <w:r>
-        <w:rPr>
-          <w:sz w:val="14"/>
-          <w:szCs w:val="14"/>
-          <w:lang w:val="fr-FR"/>
-        </w:rPr>
-        <w:t>travail, visite des services de police le  concernant  ou  visite d’huissiers à sa recherche,…). Tous les frais d’une telle situation et ceux qui en seraient la suite ou la conséquence seront à la charge du domicilié qui s’oblige à les régler.</w:t>
-      </w:r>
-    </w:p>
-    <w:p>
-      <w:pPr>
-        <w:jc w:val="both"/>
-        <w:rPr>
-          <w:sz w:val="14"/>
-          <w:szCs w:val="14"/>
-          <w:lang w:val="fr-FR"/>
-        </w:rPr>
-      </w:pPr>
-      <w:r>
-        <w:rPr>
-          <w:sz w:val="14"/>
-          <w:szCs w:val="14"/>
-          <w:lang w:val="fr-FR"/>
-        </w:rPr>
-        <w:t xml:space="preserve">Le domicilié devra, en outre, rembourser à </w:t>
-      </w:r>
-      <w:r>
-        <w:rPr>
-          <w:b/>
-          <w:bCs/>
-          <w:color w:val="32483B"/>
-          <w:sz w:val="14"/>
-          <w:szCs w:val="14"/>
-          <w:lang w:val="fr-FR"/>
-        </w:rPr>
-        <w:t xml:space="preserve">« </w:t>
-      </w:r>
-      <w:r>
-        <w:rPr>
-          <w:b/>
-          <w:bCs/>
-          <w:color w:val="32483B"/>
-          <w:sz w:val="14"/>
-          <w:szCs w:val="14"/>
-          <w:lang w:val="fr-FR"/>
-        </w:rPr>
-        <w:t>CENTIRIO SARLAU</w:t>
-      </w:r>
-      <w:r>
-        <w:rPr>
-          <w:b/>
-          <w:bCs/>
-          <w:color w:val="32483B"/>
-          <w:sz w:val="14"/>
-          <w:szCs w:val="14"/>
-          <w:lang w:val="fr-FR"/>
-        </w:rPr>
-        <w:t xml:space="preserve"> »</w:t>
-      </w:r>
-      <w:r>
-        <w:rPr>
-          <w:color w:val="124F1A" w:themeColor="accent3" w:themeShade="BF"/>
-          <w:sz w:val="14"/>
-          <w:szCs w:val="14"/>
-          <w:lang w:val="fr-FR"/>
-        </w:rPr>
-        <w:t xml:space="preserve">, </w:t>
-      </w:r>
-      <w:r>
-        <w:rPr>
-          <w:sz w:val="14"/>
-          <w:szCs w:val="14"/>
-          <w:lang w:val="fr-FR"/>
-        </w:rPr>
-        <w:t>les frais des actes extra-judiciaires et autres frais de justice motivés par des infractions aux clauses et aux conditions du présent engagement.</w:t>
-      </w:r>
-    </w:p>
-    <w:p>
-      <w:pPr>
-        <w:jc w:val="both"/>
-        <w:rPr>
-          <w:sz w:val="14"/>
-          <w:szCs w:val="14"/>
-          <w:lang w:val="fr-FR"/>
-        </w:rPr>
-      </w:pPr>
-      <w:r>
-        <w:rPr>
-          <w:sz w:val="14"/>
-          <w:szCs w:val="14"/>
-          <w:lang w:val="fr-FR"/>
-        </w:rPr>
-        <w:t xml:space="preserve">En application de ces principes et pour le cas où le recouvrement de toutes les sommes exigibles en vertu des présentes nécessiterait l’intervention d’un huissier de justice et/ou d’un avocat, le domicilié devra également rembourser à </w:t>
-      </w:r>
-      <w:r>
-        <w:rPr>
-          <w:b/>
-          <w:bCs/>
-          <w:color w:val="32483B"/>
-          <w:sz w:val="14"/>
-          <w:szCs w:val="14"/>
-          <w:lang w:val="fr-FR"/>
-        </w:rPr>
-        <w:t xml:space="preserve">« </w:t>
-      </w:r>
-      <w:r>
-        <w:rPr>
-          <w:b/>
-          <w:bCs/>
-          <w:color w:val="32483B"/>
-          <w:sz w:val="14"/>
-          <w:szCs w:val="14"/>
-          <w:lang w:val="fr-FR"/>
-        </w:rPr>
-        <w:t>CENTIRIO SARLAU</w:t>
-      </w:r>
-      <w:r>
-        <w:rPr>
-          <w:b/>
-          <w:bCs/>
-          <w:color w:val="32483B"/>
-          <w:sz w:val="14"/>
-          <w:szCs w:val="14"/>
-          <w:lang w:val="fr-FR"/>
-        </w:rPr>
-        <w:t xml:space="preserve"> </w:t>
-      </w:r>
-      <w:r>
-        <w:rPr>
-          <w:b/>
-          <w:bCs/>
-          <w:color w:val="32483B"/>
-          <w:sz w:val="14"/>
-          <w:szCs w:val="14"/>
-          <w:lang w:val="fr-FR"/>
-        </w:rPr>
-        <w:t>»</w:t>
-      </w:r>
-      <w:r>
-        <w:rPr>
-          <w:sz w:val="14"/>
-          <w:szCs w:val="14"/>
-          <w:lang w:val="fr-FR"/>
-        </w:rPr>
-        <w:t>, les honoraires et frais de recouvrement, droit de recette ou droit proportionnel qui seraient perçus par ceux-ci.</w:t>
-      </w:r>
-    </w:p>
-    <w:p>
-      <w:pPr>
-        <w:jc w:val="both"/>
-        <w:rPr>
-          <w:b/>
-          <w:bCs/>
-          <w:sz w:val="14"/>
-          <w:szCs w:val="14"/>
-          <w:u w:val="single"/>
-          <w:lang w:val="fr-FR"/>
-        </w:rPr>
-      </w:pPr>
-      <w:r>
-        <w:rPr>
-          <w:b/>
-          <w:bCs/>
-          <w:sz w:val="14"/>
-          <w:szCs w:val="14"/>
-          <w:u w:val="single"/>
-          <w:lang w:val="fr-FR"/>
-        </w:rPr>
-        <w:t xml:space="preserve">ARTICLE </w:t>
-      </w:r>
-      <w:r>
-        <w:rPr>
-          <w:b/>
-          <w:bCs/>
-          <w:sz w:val="14"/>
-          <w:szCs w:val="14"/>
-          <w:u w:val="single"/>
-          <w:lang w:val="fr-FR"/>
-        </w:rPr>
-        <w:t>8</w:t>
-      </w:r>
-      <w:r>
-        <w:rPr>
-          <w:b/>
-          <w:bCs/>
-          <w:sz w:val="14"/>
-          <w:szCs w:val="14"/>
-          <w:u w:val="single"/>
-          <w:lang w:val="fr-FR"/>
-        </w:rPr>
-        <w:t xml:space="preserve"> : FRAIS</w:t>
-      </w:r>
-    </w:p>
-    <w:p>
-      <w:pPr>
-        <w:jc w:val="both"/>
-        <w:rPr>
-          <w:sz w:val="14"/>
-          <w:szCs w:val="14"/>
-          <w:lang w:val="fr-FR"/>
-        </w:rPr>
-      </w:pPr>
-      <w:r>
-        <w:rPr>
-          <w:sz w:val="14"/>
-          <w:szCs w:val="14"/>
-          <w:lang w:val="fr-FR"/>
-        </w:rPr>
-        <w:t>Les frais et droits des présentes sont à la charge du domicilié.</w:t>
-      </w:r>
-    </w:p>
-    <w:p>
-      <w:pPr>
-        <w:jc w:val="both"/>
-        <w:rPr>
-          <w:b/>
-          <w:bCs/>
-          <w:sz w:val="14"/>
-          <w:szCs w:val="14"/>
-          <w:u w:val="single"/>
-          <w:lang w:val="fr-FR"/>
-        </w:rPr>
-      </w:pPr>
-      <w:r>
-        <w:rPr>
-          <w:b/>
-          <w:bCs/>
-          <w:sz w:val="14"/>
-          <w:szCs w:val="14"/>
-          <w:u w:val="single"/>
-          <w:lang w:val="fr-FR"/>
-        </w:rPr>
-        <w:t xml:space="preserve">ARTICLE </w:t>
-      </w:r>
-      <w:r>
-        <w:rPr>
-          <w:b/>
-          <w:bCs/>
-          <w:sz w:val="14"/>
-          <w:szCs w:val="14"/>
-          <w:u w:val="single"/>
-          <w:lang w:val="fr-FR"/>
-        </w:rPr>
-        <w:t>9</w:t>
-      </w:r>
-      <w:r>
-        <w:rPr>
-          <w:b/>
-          <w:bCs/>
-          <w:sz w:val="14"/>
-          <w:szCs w:val="14"/>
-          <w:u w:val="single"/>
-          <w:lang w:val="fr-FR"/>
-        </w:rPr>
-        <w:t xml:space="preserve"> : CLAUSE COMPROMISSOIRE</w:t>
-      </w:r>
-    </w:p>
-    <w:p>
-      <w:pPr>
-        <w:jc w:val="both"/>
-        <w:rPr>
-          <w:sz w:val="14"/>
-          <w:szCs w:val="14"/>
-          <w:lang w:val="fr-FR"/>
-        </w:rPr>
-      </w:pPr>
-      <w:r>
-        <w:rPr>
-          <w:sz w:val="14"/>
-          <w:szCs w:val="14"/>
-          <w:lang w:val="fr-FR"/>
-        </w:rPr>
-        <w:t>En cas de contestation ou de litige quant à l’exécution des présentes, les Parties s’entendent pour rendre le Tribunal de Casablanca seul compétent.</w:t>
-      </w:r>
-    </w:p>
-    <w:p>
-      <w:pPr>
-        <w:jc w:val="both"/>
-        <w:rPr>
-          <w:b/>
-          <w:bCs/>
-          <w:sz w:val="14"/>
-          <w:szCs w:val="14"/>
-          <w:u w:val="single"/>
-          <w:lang w:val="fr-FR"/>
-        </w:rPr>
-      </w:pPr>
-      <w:r>
-        <w:rPr>
-          <w:b/>
-          <w:bCs/>
-          <w:sz w:val="14"/>
-          <w:szCs w:val="14"/>
-          <w:u w:val="single"/>
-          <w:lang w:val="fr-FR"/>
-        </w:rPr>
-        <w:t>ARTICLE 1</w:t>
-      </w:r>
-      <w:r>
-        <w:rPr>
-          <w:b/>
-          <w:bCs/>
-          <w:sz w:val="14"/>
-          <w:szCs w:val="14"/>
-          <w:u w:val="single"/>
-          <w:lang w:val="fr-FR"/>
-        </w:rPr>
-        <w:t>0</w:t>
-      </w:r>
-      <w:r>
-        <w:rPr>
-          <w:b/>
-          <w:bCs/>
-          <w:sz w:val="14"/>
-          <w:szCs w:val="14"/>
-          <w:u w:val="single"/>
-          <w:lang w:val="fr-FR"/>
-        </w:rPr>
         <w:t xml:space="preserve"> : PROCURATION SPECIALE :</w:t>
       </w:r>
     </w:p>
@@ -3791,7 +3791,7 @@
           <w:szCs w:val="14"/>
           <w:lang w:val="fr-FR"/>
         </w:rPr>
-        <w:t>{{ ASSOCIE_CIVILITE }} {{PRENOM}} {{NOM}}, agissant en qualité de gérant de la société « {{DEN_STE}} {{FORME_JUR}} », donne procuration à la Société « CENTIRIO SARLAU », pour   la   réception   de   tous   courriers   ou   notifications   au   nom   de   la   société {{DEN_STE}} {{FORME_JUR}}.</w:t>
+        <w:t>{{ ASSOCIE_CIVILITE }} {{ ASSOCIE_PRENOM }} {{ ASSOCIE_NOM }}, agissant en qualité de gérant de la société « {{ SOCIETE_RAISON_SOCIALE }} {{ SOCIETE_FORME_JURIDIQUE }} », donne procuration à la Société « CENTIRIO SARLAU », pour   la   réception   de   tous   courriers   ou   notifications   au   nom   de   la   société {{ SOCIETE_RAISON_SOCIALE }} {{ SOCIETE_FORME_JURIDIQUE }}.</w:t>
       </w:r>
       <w:r>
         <w:rPr>
@@ -3994,7 +3994,7 @@
                                 <w:szCs w:val="14"/>
                                 <w:lang w:val="fr-FR"/>
                               </w:rPr>
-                              <w:t>La Société</w:t>
+                              <w:t>La Société CENTIRIO SARLAU représentée par Mr Abdeljalil RIHANALa Société CENTIRIO SARLAU représentée par Mr Abdeljalil RIHANAFait à Casablanca, Le : {{ CONTRAT_DATE }}</w:t>
                             </w:r>
                             <w:r>
                               <w:rPr>
@@ -4005,7 +4005,7 @@
                                 <w:szCs w:val="14"/>
                                 <w:lang w:val="fr-FR"/>
                               </w:rPr>
-                              <w:t xml:space="preserve"> CENTIRIO</w:t>
+                              <w:t xml:space="preserve"/>
                             </w:r>
                             <w:r>
                               <w:rPr>
@@ -4016,7 +4016,7 @@
                                 <w:szCs w:val="14"/>
                                 <w:lang w:val="fr-FR"/>
                               </w:rPr>
-                              <w:t xml:space="preserve"> SARL</w:t>
+                              <w:t xml:space="preserve"/>
                             </w:r>
                             <w:r>
                               <w:rPr>
@@ -4027,7 +4027,7 @@
                                 <w:szCs w:val="14"/>
                                 <w:lang w:val="fr-FR"/>
                               </w:rPr>
-                              <w:t>AU</w:t>
+                              <w:t/>
                             </w:r>
                             <w:r>
                               <w:rPr>
@@ -4036,7 +4036,7 @@
                                 <w:szCs w:val="16"/>
                                 <w:lang w:val="fr-FR"/>
                               </w:rPr>
-                              <w:t xml:space="preserve"> </w:t>
+                              <w:t xml:space="preserve"/>
                             </w:r>
                             <w:r>
                               <w:rPr>
@@ -4044,7 +4044,7 @@
                                 <w:szCs w:val="16"/>
                                 <w:lang w:val="fr-FR"/>
                               </w:rPr>
-                              <w:t xml:space="preserve">représentée par </w:t>
+                              <w:t xml:space="preserve"/>
                             </w:r>
                             <w:r>
                               <w:rPr>
@@ -4055,7 +4055,7 @@
                                 <w:szCs w:val="16"/>
                                 <w:lang w:val="fr-FR"/>
                               </w:rPr>
-                              <w:t>Mr Abdeljalil RIHANA</w:t>
+                              <w:t/>
                             </w:r>
                           </w:p>
                         </w:txbxContent>
@@ -4102,7 +4102,7 @@
                           <w:szCs w:val="14"/>
                           <w:lang w:val="fr-FR"/>
                         </w:rPr>
-                        <w:t>La Société</w:t>
+                        <w:t/>
                       </w:r>
                       <w:r>
                         <w:rPr>
@@ -4113,7 +4113,7 @@
                           <w:szCs w:val="14"/>
                           <w:lang w:val="fr-FR"/>
                         </w:rPr>
-                        <w:t xml:space="preserve"> CENTIRIO</w:t>
+                        <w:t xml:space="preserve"/>
                       </w:r>
                       <w:r>
                         <w:rPr>
@@ -4124,7 +4124,7 @@
                           <w:szCs w:val="14"/>
                           <w:lang w:val="fr-FR"/>
                         </w:rPr>
-                        <w:t xml:space="preserve"> SARL</w:t>
+                        <w:t xml:space="preserve"/>
                       </w:r>
                       <w:r>
                         <w:rPr>
@@ -4135,7 +4135,7 @@
                           <w:szCs w:val="14"/>
                           <w:lang w:val="fr-FR"/>
                         </w:rPr>
-                        <w:t>AU</w:t>
+                        <w:t/>
                       </w:r>
                       <w:r>
                         <w:rPr>
@@ -4144,7 +4144,7 @@
                           <w:szCs w:val="16"/>
                           <w:lang w:val="fr-FR"/>
                         </w:rPr>
-                        <w:t xml:space="preserve"> </w:t>
+                        <w:t xml:space="preserve"/>
                       </w:r>
                       <w:r>
                         <w:rPr>
@@ -4152,7 +4152,7 @@
                           <w:szCs w:val="16"/>
                           <w:lang w:val="fr-FR"/>
                         </w:rPr>
-                        <w:t xml:space="preserve">représentée par </w:t>
+                        <w:t xml:space="preserve"/>
                       </w:r>
                       <w:r>
                         <w:rPr>
@@ -4163,7 +4163,7 @@
                           <w:szCs w:val="16"/>
                           <w:lang w:val="fr-FR"/>
                         </w:rPr>
-                        <w:t>Mr Abdeljalil RIHANA</w:t>
+                        <w:t/>
                       </w:r>
                     </w:p>
                   </w:txbxContent>
@@ -4179,31 +4179,31 @@
           <w:szCs w:val="14"/>
           <w:lang w:val="fr-FR"/>
         </w:rPr>
-        <w:t xml:space="preserve">Fait </w:t>
-      </w:r>
-      <w:r>
-        <w:rPr>
-          <w:sz w:val="14"/>
-          <w:szCs w:val="14"/>
-          <w:lang w:val="fr-FR"/>
-        </w:rPr>
-        <w:t>à Casablanca</w:t>
-      </w:r>
-      <w:r>
-        <w:rPr>
-          <w:sz w:val="14"/>
-          <w:szCs w:val="14"/>
-          <w:lang w:val="fr-FR"/>
-        </w:rPr>
-        <w:t xml:space="preserve">, </w:t>
-      </w:r>
-      <w:r>
-        <w:rPr>
-          <w:sz w:val="14"/>
-          <w:szCs w:val="14"/>
-          <w:lang w:val="fr-FR"/>
-        </w:rPr>
-        <w:t xml:space="preserve">Le : </w:t>
+        <w:t xml:space="preserve"/>
+      </w:r>
+      <w:r>
+        <w:rPr>
+          <w:sz w:val="14"/>
+          <w:szCs w:val="14"/>
+          <w:lang w:val="fr-FR"/>
+        </w:rPr>
+        <w:t/>
+      </w:r>
+      <w:r>
+        <w:rPr>
+          <w:sz w:val="14"/>
+          <w:szCs w:val="14"/>
+          <w:lang w:val="fr-FR"/>
+        </w:rPr>
+        <w:t xml:space="preserve"/>
+      </w:r>
+      <w:r>
+        <w:rPr>
+          <w:sz w:val="14"/>
+          <w:szCs w:val="14"/>
+          <w:lang w:val="fr-FR"/>
+        </w:rPr>
+        <w:t xml:space="preserve"/>
       </w:r>
       <w:r>
         <w:rPr>
@@ -4214,7 +4214,7 @@
           <w:szCs w:val="14"/>
           <w:lang w:val="fr-FR"/>
         </w:rPr>
-        <w:t>{{DATE_CONTRAT}}</w:t>
+        <w:t/>
       </w:r>
     </w:p>
     <w:p>
@@ -4391,7 +4391,7 @@
                                 <w:szCs w:val="16"/>
                                 <w:lang w:val="fr-FR"/>
                               </w:rPr>
-                              <w:t xml:space="preserve">{{DEN_STE}} {{FORME_JUR}} représentée par {{ ASSOCIE_CIVILITE }} {{PRENOM}} {{NOM}}{{DEN_STE}} {{FORME_JUR}} représentée par {{ ASSOCIE_CIVILITE }} {{PRENOM}} {{NOM}}</w:t>
+                              <w:t xml:space="preserve">{{ SOCIETE_RAISON_SOCIALE }} {{ SOCIETE_FORME_JURIDIQUE }} représentée par {{ ASSOCIE_CIVILITE }} {{ ASSOCIE_PRENOM }} {{ ASSOCIE_NOM }}{{ SOCIETE_RAISON_SOCIALE }} {{ SOCIETE_FORME_JURIDIQUE }} représentée par {{ ASSOCIE_CIVILITE }} {{ ASSOCIE_PRENOM }} {{ ASSOCIE_NOM }}</w:t>
                             </w:r>
                             <w:r>
                               <w:rPr>

</xml_diff>